<commit_message>
Scrive i file Word in Garamond, già presente con Office
Il Cormorant andava installato a mano sul PC; il Garamond si apre ovunque.
PDF e PNG restano in Cormorant, che viaggia dentro il file.

Co-Authored-By: Claude Opus 5.5 <noreply@anthropic.com>
Claude-Session: https://claude.ai/code/session_0148bZgqQiCtdshijf84M1Qp
</commit_message>
<xml_diff>
--- a/testi-critici/artisti/stefano-mugnaioni/word/opera-la-luna-del-cervo.docx
+++ b/testi-critici/artisti/stefano-mugnaioni/word/opera-la-luna-del-cervo.docx
@@ -8,7 +8,7 @@
       </w:pPr>
       <w:r>
         <w:rPr>
-          <w:rFonts w:ascii="Cormorant Garamond" w:hAnsi="Cormorant Garamond" w:eastAsia="Cormorant Garamond"/>
+          <w:rFonts w:ascii="Garamond" w:hAnsi="Garamond" w:eastAsia="Garamond"/>
           <w:b/>
           <w:i w:val="0"/>
           <w:color w:val="1E1B18"/>
@@ -23,7 +23,7 @@
       </w:pPr>
       <w:r>
         <w:rPr>
-          <w:rFonts w:ascii="Cormorant Garamond" w:hAnsi="Cormorant Garamond" w:eastAsia="Cormorant Garamond"/>
+          <w:rFonts w:ascii="Garamond" w:hAnsi="Garamond" w:eastAsia="Garamond"/>
           <w:b w:val="0"/>
           <w:i/>
           <w:color w:val="1E1B18"/>
@@ -41,7 +41,7 @@
       </w:pPr>
       <w:r>
         <w:rPr>
-          <w:rFonts w:ascii="Cormorant Garamond" w:hAnsi="Cormorant Garamond" w:eastAsia="Cormorant Garamond"/>
+          <w:rFonts w:ascii="Garamond" w:hAnsi="Garamond" w:eastAsia="Garamond"/>
           <w:b w:val="0"/>
           <w:i w:val="0"/>
           <w:color w:val="6B645B"/>
@@ -57,7 +57,7 @@
       </w:pPr>
       <w:r>
         <w:rPr>
-          <w:rFonts w:ascii="Cormorant Garamond" w:hAnsi="Cormorant Garamond" w:eastAsia="Cormorant Garamond"/>
+          <w:rFonts w:ascii="Garamond" w:hAnsi="Garamond" w:eastAsia="Garamond"/>
           <w:b w:val="0"/>
           <w:i w:val="0"/>
           <w:color w:val="1E1B18"/>
@@ -73,7 +73,7 @@
       </w:pPr>
       <w:r>
         <w:rPr>
-          <w:rFonts w:ascii="Cormorant Garamond" w:hAnsi="Cormorant Garamond" w:eastAsia="Cormorant Garamond"/>
+          <w:rFonts w:ascii="Garamond" w:hAnsi="Garamond" w:eastAsia="Garamond"/>
           <w:b w:val="0"/>
           <w:i/>
           <w:color w:val="6B645B"/>
@@ -102,7 +102,7 @@
     </w:pPr>
     <w:r>
       <w:rPr>
-        <w:rFonts w:ascii="Cormorant Garamond" w:hAnsi="Cormorant Garamond"/>
+        <w:rFonts w:ascii="Garamond" w:hAnsi="Garamond"/>
         <w:color w:val="6B645B"/>
         <w:sz w:val="15"/>
       </w:rPr>

</xml_diff>